<commit_message>
Técnica em partitura, grelhas para preencher e guia simples por teste
- tecnica/: escalas, arpejos, acordes e cadências das 8 tonalidades, com dedilhação (LilyPond + PDF)
- preparar-os-testes: programa dividido pelos 4 testes, peças explicadas de forma simples, plano semanal
- grelhas-para-preencher: aula, estudo em casa, resumos semestrais, teste e metrónomo (PDF + Word)
- Planificação: dedilhações dos arpejos da ME corrigidas

Co-Authored-By: Claude Opus 5.5 <noreply@anthropic.com>
Claude-Session: https://claude.ai/code/session_01XsRadmpgMkqHXAc1ma1Zn1
</commit_message>
<xml_diff>
--- a/planificacao-leonor-silva-orgao.docx
+++ b/planificacao-leonor-silva-orgao.docx
@@ -6405,7 +6405,7 @@
                 <w:i w:val="0"/>
                 <w:sz w:val="18"/>
               </w:rPr>
-              <w:t>1 2 3 · 1 2 3 5</w:t>
+              <w:t>1 2 3 1 2 3 5</w:t>
             </w:r>
           </w:p>
         </w:tc>
@@ -6424,7 +6424,7 @@
                 <w:i w:val="0"/>
                 <w:sz w:val="18"/>
               </w:rPr>
-              <w:t>5 4 2 1 · 4 2 1</w:t>
+              <w:t>5 4 2 1 3 2 1</w:t>
             </w:r>
           </w:p>
         </w:tc>
@@ -6514,7 +6514,7 @@
                 <w:i w:val="0"/>
                 <w:sz w:val="18"/>
               </w:rPr>
-              <w:t>1 2 3 · 1 2 3 5</w:t>
+              <w:t>1 2 3 1 2 3 5</w:t>
             </w:r>
           </w:p>
         </w:tc>
@@ -6534,7 +6534,7 @@
                 <w:i w:val="0"/>
                 <w:sz w:val="18"/>
               </w:rPr>
-              <w:t>5 4 2 1 · 4 2 1</w:t>
+              <w:t>5 4 2 1 3 2 1</w:t>
             </w:r>
           </w:p>
         </w:tc>
@@ -6612,7 +6612,7 @@
                 <w:i w:val="0"/>
                 <w:sz w:val="18"/>
               </w:rPr>
-              <w:t>1 2 3 · 1 2 3 5</w:t>
+              <w:t>1 2 3 1 2 3 5</w:t>
             </w:r>
           </w:p>
         </w:tc>
@@ -6631,7 +6631,7 @@
                 <w:i w:val="0"/>
                 <w:sz w:val="18"/>
               </w:rPr>
-              <w:t>5 4 2 1 · 4 2 1</w:t>
+              <w:t>5 4 2 1 3 2 1</w:t>
             </w:r>
           </w:p>
         </w:tc>
@@ -6721,7 +6721,7 @@
                 <w:i w:val="0"/>
                 <w:sz w:val="18"/>
               </w:rPr>
-              <w:t>1 2 3 · 1 2 3 5</w:t>
+              <w:t>1 2 3 1 2 3 5</w:t>
             </w:r>
           </w:p>
         </w:tc>
@@ -6741,7 +6741,7 @@
                 <w:i w:val="0"/>
                 <w:sz w:val="18"/>
               </w:rPr>
-              <w:t>5 4 2 1 · 4 2 1</w:t>
+              <w:t>5 4 2 1 3 2 1</w:t>
             </w:r>
           </w:p>
         </w:tc>
@@ -6819,7 +6819,7 @@
                 <w:i w:val="0"/>
                 <w:sz w:val="18"/>
               </w:rPr>
-              <w:t>2 1 2 4 · 1 2 4</w:t>
+              <w:t>2 1 2 4 1 2 4</w:t>
             </w:r>
           </w:p>
         </w:tc>
@@ -6838,7 +6838,7 @@
                 <w:i w:val="0"/>
                 <w:sz w:val="18"/>
               </w:rPr>
-              <w:t>3 2 1 3 · 2 1 3</w:t>
+              <w:t>3 2 1 3 2 1 3</w:t>
             </w:r>
           </w:p>
         </w:tc>
@@ -6928,7 +6928,7 @@
                 <w:i w:val="0"/>
                 <w:sz w:val="18"/>
               </w:rPr>
-              <w:t>1 2 3 · 1 2 3 5</w:t>
+              <w:t>1 2 3 1 2 3 5</w:t>
             </w:r>
           </w:p>
         </w:tc>
@@ -6948,7 +6948,7 @@
                 <w:i w:val="0"/>
                 <w:sz w:val="18"/>
               </w:rPr>
-              <w:t>5 4 2 1 · 4 2 1</w:t>
+              <w:t>5 4 2 1 3 2 1</w:t>
             </w:r>
           </w:p>
         </w:tc>
@@ -7026,7 +7026,7 @@
                 <w:i w:val="0"/>
                 <w:sz w:val="18"/>
               </w:rPr>
-              <w:t>2 1 2 4 · 1 2 4</w:t>
+              <w:t>2 1 2 4 1 2 4</w:t>
             </w:r>
           </w:p>
         </w:tc>
@@ -7045,7 +7045,7 @@
                 <w:i w:val="0"/>
                 <w:sz w:val="18"/>
               </w:rPr>
-              <w:t>2 1 4 2 · 1 4 2</w:t>
+              <w:t>2 1 4 2 1 4 2</w:t>
             </w:r>
           </w:p>
         </w:tc>
@@ -7135,7 +7135,7 @@
                 <w:i w:val="0"/>
                 <w:sz w:val="18"/>
               </w:rPr>
-              <w:t>1 2 3 · 1 2 3 5</w:t>
+              <w:t>1 2 3 1 2 3 5</w:t>
             </w:r>
           </w:p>
         </w:tc>
@@ -7155,7 +7155,7 @@
                 <w:i w:val="0"/>
                 <w:sz w:val="18"/>
               </w:rPr>
-              <w:t>5 4 2 1 · 4 2 1 (ou 5 3 2 1)</w:t>
+              <w:t>5 4 2 1 3 2 1</w:t>
             </w:r>
           </w:p>
         </w:tc>

</xml_diff>